<commit_message>
Update guides and checksums for validated NetBox Appliance 1.2.0
</commit_message>
<xml_diff>
--- a/NetBox-Appliance-Build-Guide.docx
+++ b/NetBox-Appliance-Build-Guide.docx
@@ -17,6 +17,14 @@
       </w:pPr>
       <w:r>
         <w:t>The OVA is the recommended deployment path and contains all runtime images. This source bundle is provided for owners who want to inspect or adapt the custom connector manager, theme, first-boot setup and backup code.</w:t>
+      </w:r>
+    </w:p>
+    <w:p>
+      <w:pPr>
+        <w:widowControl/>
+      </w:pPr>
+      <w:r>
+        <w:t>Version 1.2 adds owner-configured VCF Identity Broker SSO, visible local/IDB login labels, and optional VMware NIC/MAC inventory with association to existing IP records. No lab identity, source connection or credential is supplied.</w:t>
       </w:r>
     </w:p>
     <w:p>

</xml_diff>